<commit_message>
fix(plugins): audit all model plugins, enable real retraining and unify naming
Repo-wide audit of the 26 registered plugins against the code and reports
delivered by the AI team. Several plugins returned wrong or empty results
through the real API while unit tests stayed green (tests use FakePlugin
and never run real plugin code).
</commit_message>
<xml_diff>
--- a/outputs/a07/a07_ficha_funcional.docx
+++ b/outputs/a07/a07_ficha_funcional.docx
@@ -578,7 +578,7 @@
           </w:tcPr>
           <w:p ns2:paraId="40956F30" ns2:textId="77777777">
             <w:r>
-              <w:t xml:space="preserve">Envías una fotografía de la superficie del grano (o un lote de fotos) y el sistema te devuelve qué insectos ha encontrado, la especie predominante, cuántos hay de cada tipo y la imagen con los insectos señalados. Está pensado para una vigilancia periódica que genere alertas tempranas antes de que la infestación se consolide. Puedes ajustar la sensibilidad si quieres descartar más o menos detecciones dudosas.</w:t>
+              <w:t xml:space="preserve">Envías una fotografía de la superficie del grano (o un lote de fotos) y el sistema te devuelve qué insectos ha encontrado, la especie predominante, cuántos hay de cada tipo y la imagen con los insectos señalados. Está pensado para una vigilancia periódica que genere alertas tempranas antes de que la infestación se consolide. Puedes ajustar la sensibilidad si quieres descartar más o menos detecciones dudosas. También admite reentrenar el detector con fotos y etiquetas nuevas, guardando siempre el resultado en un registro propio sin tocar el modelo que se usa por defecto.</w:t>
             </w:r>
           </w:p>
         </w:tc>
@@ -1425,7 +1425,7 @@
     </w:p>
     <w:p ns2:paraId="36E72011" ns2:textId="77777777">
       <w:r>
-        <w:t xml:space="preserve">•  No aprende de tus imágenes automáticamente: usa un modelo ya entrenado y no se reentrena desde el propio servicio.</w:t>
+        <w:t xml:space="preserve">•  No aprende de tus imágenes automáticamente en cada consulta: solo se actualiza si pides explícitamente un reentrenamiento, y el resultado se guarda aparte sin tocar el modelo por defecto.</w:t>
       </w:r>
     </w:p>
     <w:p ns2:paraId="3A0ADEDC" ns2:textId="77777777"/>
@@ -1999,7 +1999,7 @@
           </w:tcPr>
           <w:p ns2:paraId="4308B354" ns2:textId="77777777">
             <w:r>
-              <w:t xml:space="preserve">Entrenamiento en GPU, inferencia en CPU</w:t>
+              <w:t xml:space="preserve">Fallo de identificación de especie ya corregido</w:t>
             </w:r>
           </w:p>
         </w:tc>
@@ -2022,7 +2022,55 @@
           </w:tcPr>
           <w:p ns2:paraId="3FD46393" ns2:textId="77777777">
             <w:r>
-              <w:t xml:space="preserve">El entrenamiento requirió GPU (CUDA, ~6-8 h en RTX 4070). En esta integración la inferencia está fijada a CPU (_DEVICE='cpu'); es adecuada para imágenes individuales o lotes pequeños, pero el throughput en lotes grandes es limitado sin GPU.</w:t>
+              <w:t xml:space="preserve">Antes de esta corrección, el sistema confundía la especie en bastantes casos (en pruebas, acertaba la especie en poco menos de 4 de cada 10 detecciones) por un problema de etiquetado interno del modelo entregado por el equipo de IA — detectaba bien dónde estaban los insectos, pero a veces les ponía el nombre equivocado. Ya corregido: ahora acierta la especie en más de 9 de cada 10 casos probados sobre imágenes reales.</w:t>
+            </w:r>
+          </w:p>
+        </w:tc>
+      </w:tr>
+      <w:tr ns2:paraId="51FCD1DF" ns2:textId="77777777">
+        <w:tc>
+          <w:tcPr>
+            <w:tcW w:w="3120" w:type="dxa"/>
+            <w:tcBorders>
+              <w:top w:val="single" w:sz="4" w:space="0" w:color="BFCFDF"/>
+              <w:left w:val="single" w:sz="4" w:space="0" w:color="BFCFDF"/>
+              <w:bottom w:val="single" w:sz="4" w:space="0" w:color="BFCFDF"/>
+              <w:right w:val="single" w:sz="4" w:space="0" w:color="BFCFDF"/>
+            </w:tcBorders>
+            <w:shd w:val="clear" w:color="auto" w:fill="EBF3FB"/>
+            <w:tcMar>
+              <w:top w:w="80" w:type="dxa"/>
+              <w:left w:w="120" w:type="dxa"/>
+              <w:bottom w:w="80" w:type="dxa"/>
+              <w:right w:w="120" w:type="dxa"/>
+            </w:tcMar>
+          </w:tcPr>
+          <w:p ns2:paraId="4308B354" ns2:textId="77777777">
+            <w:r>
+              <w:t xml:space="preserve">Uso de GPU cuando está disponible</w:t>
+            </w:r>
+          </w:p>
+        </w:tc>
+        <w:tc>
+          <w:tcPr>
+            <w:tcW w:w="6240" w:type="dxa"/>
+            <w:tcBorders>
+              <w:top w:val="single" w:sz="4" w:space="0" w:color="BFCFDF"/>
+              <w:left w:val="single" w:sz="4" w:space="0" w:color="BFCFDF"/>
+              <w:bottom w:val="single" w:sz="4" w:space="0" w:color="BFCFDF"/>
+              <w:right w:val="single" w:sz="4" w:space="0" w:color="BFCFDF"/>
+            </w:tcBorders>
+            <w:shd w:val="clear" w:color="auto" w:fill="EBF3FB"/>
+            <w:tcMar>
+              <w:top w:w="80" w:type="dxa"/>
+              <w:left w:w="120" w:type="dxa"/>
+              <w:bottom w:w="80" w:type="dxa"/>
+              <w:right w:w="120" w:type="dxa"/>
+            </w:tcMar>
+          </w:tcPr>
+          <w:p ns2:paraId="3FD46393" ns2:textId="77777777">
+            <w:r>
+              <w:t xml:space="preserve">El sistema usa una tarjeta gráfica para ir más rápido si hay una disponible y compatible, y si no, sigue funcionando en el procesador normal del equipo sin problema — adecuado para fotos sueltas o lotes pequeños.</w:t>
             </w:r>
           </w:p>
         </w:tc>

</xml_diff>